<commit_message>
Completed GDV5002 marking and updated Excel sheet of overall marks
</commit_message>
<xml_diff>
--- a/T1/GDV5002/Marking/Resit_Deferral_or_NS/Jay_Robertson_20297298/GDV5002 Marking 25.docx
+++ b/T1/GDV5002/Marking/Resit_Deferral_or_NS/Jay_Robertson_20297298/GDV5002 Marking 25.docx
@@ -7,7 +7,13 @@
         <w:t>GDV5002 Marking 25/26</w:t>
       </w:r>
       <w:r>
-        <w:t xml:space="preserve">_Deferal </w:t>
+        <w:t>_Defe</w:t>
+      </w:r>
+      <w:r>
+        <w:t>r</w:t>
+      </w:r>
+      <w:r>
+        <w:t xml:space="preserve">ral </w:t>
       </w:r>
     </w:p>
     <w:p>
@@ -24,6 +30,9 @@
     <w:p>
       <w:r>
         <w:t>Student ID:</w:t>
+      </w:r>
+      <w:r>
+        <w:t xml:space="preserve"> st20297298</w:t>
       </w:r>
     </w:p>
     <w:tbl>
@@ -244,6 +253,14 @@
                       <w:spacing w:val="-5"/>
                     </w:rPr>
                   </w:pPr>
+                  <w:r>
+                    <w:rPr>
+                      <w:rFonts w:ascii="Arial"/>
+                      <w:b/>
+                      <w:spacing w:val="-5"/>
+                    </w:rPr>
+                    <w:t>27</w:t>
+                  </w:r>
                 </w:p>
               </w:tc>
               <w:tc>
@@ -320,6 +337,13 @@
                       <w:spacing w:val="-5"/>
                     </w:rPr>
                   </w:pPr>
+                  <w:r>
+                    <w:rPr>
+                      <w:rFonts w:ascii="Arial"/>
+                      <w:spacing w:val="-5"/>
+                    </w:rPr>
+                    <w:t>12</w:t>
+                  </w:r>
                 </w:p>
               </w:tc>
               <w:tc>
@@ -540,6 +564,13 @@
                       <w:spacing w:val="-5"/>
                     </w:rPr>
                   </w:pPr>
+                  <w:r>
+                    <w:rPr>
+                      <w:rFonts w:ascii="Arial"/>
+                      <w:spacing w:val="-5"/>
+                    </w:rPr>
+                    <w:t>4</w:t>
+                  </w:r>
                 </w:p>
               </w:tc>
               <w:tc>
@@ -679,6 +710,13 @@
                       <w:spacing w:val="-5"/>
                     </w:rPr>
                   </w:pPr>
+                  <w:r>
+                    <w:rPr>
+                      <w:rFonts w:ascii="Arial"/>
+                      <w:spacing w:val="-5"/>
+                    </w:rPr>
+                    <w:t>5</w:t>
+                  </w:r>
                 </w:p>
               </w:tc>
               <w:tc>
@@ -832,6 +870,14 @@
                       <w:spacing w:val="-5"/>
                     </w:rPr>
                   </w:pPr>
+                  <w:r>
+                    <w:rPr>
+                      <w:rFonts w:ascii="Arial"/>
+                      <w:b/>
+                      <w:spacing w:val="-5"/>
+                    </w:rPr>
+                    <w:t>10</w:t>
+                  </w:r>
                 </w:p>
               </w:tc>
               <w:tc>
@@ -946,6 +992,14 @@
                       <w:spacing w:val="-5"/>
                     </w:rPr>
                   </w:pPr>
+                  <w:r>
+                    <w:rPr>
+                      <w:rFonts w:ascii="Arial"/>
+                      <w:bCs/>
+                      <w:spacing w:val="-5"/>
+                    </w:rPr>
+                    <w:t>3</w:t>
+                  </w:r>
                 </w:p>
               </w:tc>
               <w:tc>
@@ -1019,6 +1073,14 @@
                       <w:spacing w:val="-5"/>
                     </w:rPr>
                   </w:pPr>
+                  <w:r>
+                    <w:rPr>
+                      <w:rFonts w:ascii="Arial"/>
+                      <w:bCs/>
+                      <w:spacing w:val="-5"/>
+                    </w:rPr>
+                    <w:t>2</w:t>
+                  </w:r>
                 </w:p>
               </w:tc>
               <w:tc>
@@ -1095,6 +1157,14 @@
                       <w:spacing w:val="-5"/>
                     </w:rPr>
                   </w:pPr>
+                  <w:r>
+                    <w:rPr>
+                      <w:rFonts w:ascii="Arial"/>
+                      <w:bCs/>
+                      <w:spacing w:val="-5"/>
+                    </w:rPr>
+                    <w:t>2</w:t>
+                  </w:r>
                 </w:p>
               </w:tc>
               <w:tc>
@@ -1171,6 +1241,14 @@
                       <w:spacing w:val="-5"/>
                     </w:rPr>
                   </w:pPr>
+                  <w:r>
+                    <w:rPr>
+                      <w:rFonts w:ascii="Arial"/>
+                      <w:bCs/>
+                      <w:spacing w:val="-5"/>
+                    </w:rPr>
+                    <w:t>3</w:t>
+                  </w:r>
                 </w:p>
               </w:tc>
               <w:tc>
@@ -1984,9 +2062,20 @@
                     <w:ind w:left="109"/>
                     <w:rPr>
                       <w:rFonts w:ascii="Arial"/>
+                      <w:b/>
+                      <w:bCs/>
                       <w:spacing w:val="-5"/>
                     </w:rPr>
                   </w:pPr>
+                  <w:r>
+                    <w:rPr>
+                      <w:rFonts w:ascii="Arial"/>
+                      <w:b/>
+                      <w:bCs/>
+                      <w:spacing w:val="-5"/>
+                    </w:rPr>
+                    <w:t>50</w:t>
+                  </w:r>
                 </w:p>
               </w:tc>
               <w:tc>
@@ -2001,12 +2090,16 @@
                     <w:ind w:left="109"/>
                     <w:rPr>
                       <w:rFonts w:ascii="Arial"/>
+                      <w:b/>
+                      <w:bCs/>
                       <w:spacing w:val="-5"/>
                     </w:rPr>
                   </w:pPr>
                   <w:r>
                     <w:rPr>
                       <w:rFonts w:ascii="Arial"/>
+                      <w:b/>
+                      <w:bCs/>
                       <w:spacing w:val="-5"/>
                     </w:rPr>
                     <w:t>100%</w:t>
@@ -2039,7 +2132,7 @@
       <w:tr>
         <w:tc>
           <w:tcPr>
-            <w:tcW w:w="2122" w:type="dxa"/>
+            <w:tcW w:w="1843" w:type="dxa"/>
             <w:shd w:val="clear" w:color="auto" w:fill="D1D1D1" w:themeFill="background2" w:themeFillShade="E6"/>
           </w:tcPr>
           <w:p>
@@ -2055,7 +2148,7 @@
         </w:tc>
         <w:tc>
           <w:tcPr>
-            <w:tcW w:w="13479" w:type="dxa"/>
+            <w:tcW w:w="7173" w:type="dxa"/>
             <w:shd w:val="clear" w:color="auto" w:fill="D1D1D1" w:themeFill="background2" w:themeFillShade="E6"/>
           </w:tcPr>
           <w:p>
@@ -2080,7 +2173,7 @@
       <w:tr>
         <w:tc>
           <w:tcPr>
-            <w:tcW w:w="2122" w:type="dxa"/>
+            <w:tcW w:w="1843" w:type="dxa"/>
             <w:shd w:val="clear" w:color="auto" w:fill="D1D1D1" w:themeFill="background2" w:themeFillShade="E6"/>
           </w:tcPr>
           <w:p>
@@ -2139,7 +2232,7 @@
         </w:tc>
         <w:tc>
           <w:tcPr>
-            <w:tcW w:w="13479" w:type="dxa"/>
+            <w:tcW w:w="7173" w:type="dxa"/>
             <w:shd w:val="clear" w:color="auto" w:fill="C1E4F5" w:themeFill="accent1" w:themeFillTint="33"/>
           </w:tcPr>
           <w:p>
@@ -2311,7 +2404,7 @@
       <w:tr>
         <w:tc>
           <w:tcPr>
-            <w:tcW w:w="2122" w:type="dxa"/>
+            <w:tcW w:w="1843" w:type="dxa"/>
             <w:shd w:val="clear" w:color="auto" w:fill="D1D1D1" w:themeFill="background2" w:themeFillShade="E6"/>
           </w:tcPr>
           <w:p>
@@ -2351,7 +2444,7 @@
         </w:tc>
         <w:tc>
           <w:tcPr>
-            <w:tcW w:w="13479" w:type="dxa"/>
+            <w:tcW w:w="7173" w:type="dxa"/>
             <w:shd w:val="clear" w:color="auto" w:fill="C1E4F5" w:themeFill="accent1" w:themeFillTint="33"/>
           </w:tcPr>
           <w:p>
@@ -2616,7 +2709,7 @@
       <w:tr>
         <w:tc>
           <w:tcPr>
-            <w:tcW w:w="2122" w:type="dxa"/>
+            <w:tcW w:w="1843" w:type="dxa"/>
             <w:shd w:val="clear" w:color="auto" w:fill="D1D1D1" w:themeFill="background2" w:themeFillShade="E6"/>
           </w:tcPr>
           <w:p>
@@ -2657,7 +2750,7 @@
         </w:tc>
         <w:tc>
           <w:tcPr>
-            <w:tcW w:w="13479" w:type="dxa"/>
+            <w:tcW w:w="7173" w:type="dxa"/>
             <w:shd w:val="clear" w:color="auto" w:fill="C1E4F5" w:themeFill="accent1" w:themeFillTint="33"/>
           </w:tcPr>
           <w:p>
@@ -3057,7 +3150,7 @@
       <w:tr>
         <w:tc>
           <w:tcPr>
-            <w:tcW w:w="2122" w:type="dxa"/>
+            <w:tcW w:w="1843" w:type="dxa"/>
             <w:shd w:val="clear" w:color="auto" w:fill="D1D1D1" w:themeFill="background2" w:themeFillShade="E6"/>
           </w:tcPr>
           <w:p>
@@ -3116,7 +3209,7 @@
         </w:tc>
         <w:tc>
           <w:tcPr>
-            <w:tcW w:w="13479" w:type="dxa"/>
+            <w:tcW w:w="7173" w:type="dxa"/>
             <w:shd w:val="clear" w:color="auto" w:fill="C1E4F5" w:themeFill="accent1" w:themeFillTint="33"/>
           </w:tcPr>
           <w:p>
@@ -3448,7 +3541,7 @@
       <w:tr>
         <w:tc>
           <w:tcPr>
-            <w:tcW w:w="2122" w:type="dxa"/>
+            <w:tcW w:w="1843" w:type="dxa"/>
             <w:shd w:val="clear" w:color="auto" w:fill="D1D1D1" w:themeFill="background2" w:themeFillShade="E6"/>
           </w:tcPr>
           <w:p>
@@ -3515,7 +3608,7 @@
         </w:tc>
         <w:tc>
           <w:tcPr>
-            <w:tcW w:w="13479" w:type="dxa"/>
+            <w:tcW w:w="7173" w:type="dxa"/>
             <w:shd w:val="clear" w:color="auto" w:fill="C1E4F5" w:themeFill="accent1" w:themeFillTint="33"/>
           </w:tcPr>
           <w:p>
@@ -4153,7 +4246,7 @@
       <w:tr>
         <w:tc>
           <w:tcPr>
-            <w:tcW w:w="2122" w:type="dxa"/>
+            <w:tcW w:w="1843" w:type="dxa"/>
             <w:shd w:val="clear" w:color="auto" w:fill="D1D1D1" w:themeFill="background2" w:themeFillShade="E6"/>
           </w:tcPr>
           <w:p>
@@ -4189,7 +4282,7 @@
         </w:tc>
         <w:tc>
           <w:tcPr>
-            <w:tcW w:w="13479" w:type="dxa"/>
+            <w:tcW w:w="7173" w:type="dxa"/>
             <w:shd w:val="clear" w:color="auto" w:fill="C1E4F5" w:themeFill="accent1" w:themeFillTint="33"/>
           </w:tcPr>
           <w:p>
@@ -4625,12 +4718,61 @@
     <w:p/>
     <w:p>
       <w:r>
+        <w:t xml:space="preserve">Aademic writing – You start your first slide with ‘Created a box…’ which is still first-person as it begs the question ‘who created the box?’, you have just removed the ‘I’ from the start of the sentence. You could have said ‘A box with X dimensions was created and given x number of segments.’ Another point here is thatyou need to be specific. You say ‘many segments’, but </w:t>
+      </w:r>
+      <w:r>
+        <w:rPr>
+          <w:i/>
+          <w:iCs/>
+        </w:rPr>
+        <w:t>how many</w:t>
+      </w:r>
+      <w:r>
+        <w:t>? You need to include as much detail as you can!</w:t>
+      </w:r>
+    </w:p>
+    <w:p>
+      <w:r>
+        <w:t>You haven’t included any citations or references for your images and textures!</w:t>
+      </w:r>
+    </w:p>
+    <w:p>
+      <w:r>
         <w:t>I like the variation on the brief with your character being a whistle-blower in a big company, very imaginative whilst staying within the confines of the brief.</w:t>
       </w:r>
     </w:p>
     <w:p>
       <w:r>
-        <w:t>Presentation – Volume is low.</w:t>
+        <w:lastRenderedPageBreak/>
+        <w:t>Some good 3D models here, Jay, and there is some discussion of modifiers and techniques used. I would have liked to have seen more images showing the process of how the models were created – building up from the rough concept to the finished asset. The ‘Worker Desk’ is the only example in the portfolio where you come close to doing this.</w:t>
+      </w:r>
+    </w:p>
+    <w:p>
+      <w:r>
+        <w:t xml:space="preserve">Animation is mentioned throughout the document, </w:t>
+      </w:r>
+      <w:r>
+        <w:t>but you</w:t>
+      </w:r>
+      <w:r>
+        <w:t xml:space="preserve"> haven’t gone into how it was achieved, </w:t>
+      </w:r>
+      <w:r>
+        <w:t xml:space="preserve">how fast the animations had to be, the number of frames… </w:t>
+      </w:r>
+      <w:r>
+        <w:t xml:space="preserve">Some good animations, but it’s a pity that you didn’t get them working in UE5. You do demo them in 3Ds </w:t>
+      </w:r>
+      <w:r>
+        <w:t>Max</w:t>
+      </w:r>
+      <w:r>
+        <w:t>.</w:t>
+      </w:r>
+    </w:p>
+    <w:p>
+      <w:r>
+        <w:t>You have used a mixture of UV UnWrap and UV Map in 3Ds Max, but there is no discussion of how textures were created. What DCC was used (Photoshop, Substance Painter). UV maps have a lot of empty space and there is a lack of optimisation. Again, this was something that was discussed at length and demonstrated in the lab. You seem to be focused more on how the textures look in 3Ds Max rather than how they should look in Unreal Engine.</w:t>
       </w:r>
     </w:p>
     <w:p>
@@ -4640,18 +4782,23 @@
     </w:p>
     <w:p>
       <w:r>
-        <w:lastRenderedPageBreak/>
-        <w:t xml:space="preserve">Some good animations, but it’s a pity that you didn’t get them working in UE5. You do demo them in 3Ds </w:t>
-      </w:r>
-      <w:proofErr w:type="gramStart"/>
-      <w:r>
-        <w:t>Max</w:t>
-      </w:r>
-      <w:proofErr w:type="gramEnd"/>
-      <w:r>
-        <w:t xml:space="preserve"> however.</w:t>
+        <w:t>Level Design. You have highlighted some areas of interest, but this should have been a much deeper section. We covered a lot of level design principes in the lab, such as working up from a sketch of a floor plan to grey boxing in Max or Unreal.</w:t>
       </w:r>
     </w:p>
+    <w:p>
+      <w:r>
+        <w:t xml:space="preserve"> A good example of this is Level 2. You have added two servers that the player can hide behind while there is a meeting taking place. Firstly, would they have servers in a meeting room? Surely these would need to be in a </w:t>
+      </w:r>
+      <w:r>
+        <w:t>temperature controlled and highly secure area. And how does the player get across the open space to the servers without being spotted, and where are they going? You haven’t thought through your level design from the perspective of someone playing the game.</w:t>
+      </w:r>
+    </w:p>
+    <w:p>
+      <w:r>
+        <w:t>There is some good work here, Jay, but I think you would have done so much better had you been more present in the lab and asked more questions when you had the opportunity. There are errors and misunderstanding in your work on how to use textures in UE5 that I did cover, and could have happily assisted with at the time if you weren’t sure how to implement them.</w:t>
+      </w:r>
+    </w:p>
+    <w:p/>
     <w:sectPr>
       <w:pgSz w:w="11906" w:h="16838"/>
       <w:pgMar w:top="1440" w:right="1440" w:bottom="1440" w:left="1440" w:header="708" w:footer="708" w:gutter="0"/>

</xml_diff>